<commit_message>
feat: letterhead margins 3.5/2.5/1.5 cm; age typed after the name
- Print layout for the clinic's letterhead: 3.5 cm clear at the top
  (header), 2.5 cm at the bottom (footer; page-number line just above it,
  text ends at 3.2 cm), 1.5 cm at the sides. Tables use the wider page.
  The editor's letterhead strips follow each report's margins.
- The clinic types the age after the name ("ARUN KUMAR 27") because the
  scanner's age field is empty: a trailing 1-120 (optionally "Y"/"yrs")
  becomes the age when the scanner sent none, and is dropped from the name.
  A remade report updates the name shown in the dashboard.

Co-Authored-By: Claude Opus 5.5 <noreply@anthropic.com>
</commit_message>
<xml_diff>
--- a/templates/abdomen_pelvis_female.docx
+++ b/templates/abdomen_pelvis_female.docx
@@ -27,7 +27,7 @@
         <w:gridCol w:w="1872"/>
         <w:gridCol w:w="3528"/>
         <w:gridCol w:w="1655"/>
-        <w:gridCol w:w="2692"/>
+        <w:gridCol w:w="3148"/>
       </w:tblGrid>
       <w:tr>
         <w:trPr>
@@ -92,7 +92,7 @@
         </w:tc>
         <w:tc>
           <w:tcPr>
-            <w:tcW w:type="dxa" w:w="2693"/>
+            <w:tcW w:type="dxa" w:w="3149"/>
             <w:vAlign w:val="center"/>
           </w:tcPr>
           <w:p>
@@ -173,7 +173,7 @@
         </w:tc>
         <w:tc>
           <w:tcPr>
-            <w:tcW w:type="dxa" w:w="2693"/>
+            <w:tcW w:type="dxa" w:w="3149"/>
             <w:vAlign w:val="center"/>
           </w:tcPr>
           <w:p>
@@ -216,7 +216,7 @@
         </w:tc>
         <w:tc>
           <w:tcPr>
-            <w:tcW w:type="dxa" w:w="7877"/>
+            <w:tcW w:type="dxa" w:w="8333"/>
             <w:gridSpan w:val="3"/>
             <w:vAlign w:val="center"/>
           </w:tcPr>
@@ -259,7 +259,7 @@
         </w:tc>
         <w:tc>
           <w:tcPr>
-            <w:tcW w:type="dxa" w:w="7877"/>
+            <w:tcW w:type="dxa" w:w="8333"/>
             <w:gridSpan w:val="3"/>
             <w:vAlign w:val="center"/>
           </w:tcPr>
@@ -304,7 +304,7 @@
       </w:tblPr>
       <w:tblGrid>
         <w:gridCol w:w="2520"/>
-        <w:gridCol w:w="7228"/>
+        <w:gridCol w:w="7684"/>
       </w:tblGrid>
       <w:tr>
         <w:trPr>
@@ -329,7 +329,7 @@
         </w:tc>
         <w:tc>
           <w:tcPr>
-            <w:tcW w:type="dxa" w:w="7229"/>
+            <w:tcW w:type="dxa" w:w="7685"/>
           </w:tcPr>
           <w:p>
             <w:pPr>
@@ -368,7 +368,7 @@
         </w:tc>
         <w:tc>
           <w:tcPr>
-            <w:tcW w:type="dxa" w:w="7229"/>
+            <w:tcW w:type="dxa" w:w="7685"/>
           </w:tcPr>
           <w:p>
             <w:pPr>
@@ -407,7 +407,7 @@
         </w:tc>
         <w:tc>
           <w:tcPr>
-            <w:tcW w:type="dxa" w:w="7229"/>
+            <w:tcW w:type="dxa" w:w="7685"/>
           </w:tcPr>
           <w:p>
             <w:pPr>
@@ -446,7 +446,7 @@
         </w:tc>
         <w:tc>
           <w:tcPr>
-            <w:tcW w:type="dxa" w:w="7229"/>
+            <w:tcW w:type="dxa" w:w="7685"/>
           </w:tcPr>
           <w:p>
             <w:pPr>
@@ -485,7 +485,7 @@
         </w:tc>
         <w:tc>
           <w:tcPr>
-            <w:tcW w:type="dxa" w:w="7229"/>
+            <w:tcW w:type="dxa" w:w="7685"/>
           </w:tcPr>
           <w:p>
             <w:pPr>
@@ -524,7 +524,7 @@
         </w:tc>
         <w:tc>
           <w:tcPr>
-            <w:tcW w:type="dxa" w:w="7229"/>
+            <w:tcW w:type="dxa" w:w="7685"/>
           </w:tcPr>
           <w:p>
             <w:pPr>
@@ -563,7 +563,7 @@
         </w:tc>
         <w:tc>
           <w:tcPr>
-            <w:tcW w:type="dxa" w:w="7229"/>
+            <w:tcW w:type="dxa" w:w="7685"/>
           </w:tcPr>
           <w:p>
             <w:pPr>
@@ -602,7 +602,7 @@
         </w:tc>
         <w:tc>
           <w:tcPr>
-            <w:tcW w:type="dxa" w:w="7229"/>
+            <w:tcW w:type="dxa" w:w="7685"/>
           </w:tcPr>
           <w:p>
             <w:pPr>
@@ -641,7 +641,7 @@
         </w:tc>
         <w:tc>
           <w:tcPr>
-            <w:tcW w:type="dxa" w:w="7229"/>
+            <w:tcW w:type="dxa" w:w="7685"/>
           </w:tcPr>
           <w:p>
             <w:pPr>
@@ -680,7 +680,7 @@
         </w:tc>
         <w:tc>
           <w:tcPr>
-            <w:tcW w:type="dxa" w:w="7229"/>
+            <w:tcW w:type="dxa" w:w="7685"/>
           </w:tcPr>
           <w:p>
             <w:pPr>
@@ -719,7 +719,7 @@
         </w:tc>
         <w:tc>
           <w:tcPr>
-            <w:tcW w:type="dxa" w:w="7229"/>
+            <w:tcW w:type="dxa" w:w="7685"/>
           </w:tcPr>
           <w:p>
             <w:pPr>
@@ -758,7 +758,7 @@
         </w:tc>
         <w:tc>
           <w:tcPr>
-            <w:tcW w:type="dxa" w:w="7229"/>
+            <w:tcW w:type="dxa" w:w="7685"/>
           </w:tcPr>
           <w:p>
             <w:pPr>
@@ -842,8 +842,8 @@
     </w:p>
     <w:sectPr>
       <w:footerReference w:type="default" r:id="rId9"/>
-      <w:pgSz w:w="11909" w:h="16834"/>
-      <w:pgMar w:top="2160" w:right="1080" w:bottom="2664" w:left="1080" w:header="720" w:footer="2160" w:gutter="0"/>
+      <w:pgSz w:w="11906" w:h="16838"/>
+      <w:pgMar w:top="1984" w:right="850" w:bottom="1814" w:left="850" w:header="720" w:footer="1474" w:gutter="0"/>
       <w:cols w:space="720"/>
       <w:docGrid w:linePitch="360"/>
     </w:sectPr>

</xml_diff>

<commit_message>
feat: prostate and ovary volumes in the abdomen-pelvis forms
- Male form: "Prostate: ... measuring __ cm, volume ~__ ml". The volume is
  the scanner's (labelled "Prostate Volume", or the Volume shown on the
  prostate image), else calculated as the three sizes multiplied / 2, as
  the clinic does.
- Female form: "Right/Left ovary: Measuring __ cm, volume ~__ ml". The
  volume only comes from the scanner - labelled "Ovary Volume", or the
  Volume shown when the ovary is measured in 3 distances; never calculated.
- Volume units (ml, cc, cm3, mm3) convert to ml.
- Scan-panel suggestions offer the volumes alongside the sizes.

Co-Authored-By: Claude Opus 5.5 <noreply@anthropic.com>
</commit_message>
<xml_diff>
--- a/templates/abdomen_pelvis_female.docx
+++ b/templates/abdomen_pelvis_female.docx
@@ -652,7 +652,7 @@
                 <w:b w:val="0"/>
                 <w:sz w:val="22"/>
               </w:rPr>
-              <w:t>Measuring {{right_ovary_size}} cm.</w:t>
+              <w:t>Measuring {{right_ovary_size}} cm, volume ~{{right_ovary_volume}} ml.</w:t>
             </w:r>
           </w:p>
         </w:tc>
@@ -691,7 +691,7 @@
                 <w:b w:val="0"/>
                 <w:sz w:val="22"/>
               </w:rPr>
-              <w:t>Measuring {{left_ovary_size}} cm.</w:t>
+              <w:t>Measuring {{left_ovary_size}} cm, volume ~{{left_ovary_volume}} ml.</w:t>
             </w:r>
           </w:p>
         </w:tc>

</xml_diff>

<commit_message>
feat: larger print sizes and a blank line under the letterhead header
- Body text (findings, headings, impression, signature, images heading)
  11 -> 13 pt; title 14 -> 15, tables 10.5 -> 11.5, notes and declaration
  9 -> 10, page-number line 8 -> 9.
- A blank line between the letterhead's header space and the title.

Co-Authored-By: Claude Opus 5.5 <noreply@anthropic.com>
</commit_message>
<xml_diff>
--- a/templates/abdomen_pelvis_female.docx
+++ b/templates/abdomen_pelvis_female.docx
@@ -2,6 +2,7 @@
 <file path=word/document.xml><?xml version="1.0" encoding="utf-8"?>
 <w:document xmlns:wpc="http://schemas.microsoft.com/office/word/2010/wordprocessingCanvas" xmlns:mo="http://schemas.microsoft.com/office/mac/office/2008/main" xmlns:mc="http://schemas.openxmlformats.org/markup-compatibility/2006" xmlns:mv="urn:schemas-microsoft-com:mac:vml" xmlns:o="urn:schemas-microsoft-com:office:office" xmlns:r="http://schemas.openxmlformats.org/officeDocument/2006/relationships" xmlns:m="http://schemas.openxmlformats.org/officeDocument/2006/math" xmlns:v="urn:schemas-microsoft-com:vml" xmlns:wp14="http://schemas.microsoft.com/office/word/2010/wordprocessingDrawing" xmlns:wp="http://schemas.openxmlformats.org/drawingml/2006/wordprocessingDrawing" xmlns:w10="urn:schemas-microsoft-com:office:word" xmlns:w="http://schemas.openxmlformats.org/wordprocessingml/2006/main" xmlns:w14="http://schemas.microsoft.com/office/word/2010/wordml" xmlns:wpg="http://schemas.microsoft.com/office/word/2010/wordprocessingGroup" xmlns:wpi="http://schemas.microsoft.com/office/word/2010/wordprocessingInk" xmlns:wne="http://schemas.microsoft.com/office/word/2006/wordml" xmlns:wps="http://schemas.microsoft.com/office/word/2010/wordprocessingShape" mc:Ignorable="w14 wp14">
   <w:body>
+    <w:p/>
     <w:p>
       <w:pPr>
         <w:spacing w:after="160"/>
@@ -10,7 +11,7 @@
       <w:r>
         <w:rPr>
           <w:b/>
-          <w:sz w:val="28"/>
+          <w:sz w:val="30"/>
           <w:u w:val="single"/>
         </w:rPr>
         <w:t>ABDOMINO-PELVIC ULTRASOUND REPORT</w:t>
@@ -46,7 +47,7 @@
             <w:r>
               <w:rPr>
                 <w:b/>
-                <w:sz w:val="21"/>
+                <w:sz w:val="23"/>
               </w:rPr>
               <w:t>Patient Name</w:t>
             </w:r>
@@ -65,7 +66,7 @@
             <w:r>
               <w:rPr>
                 <w:b w:val="0"/>
-                <w:sz w:val="21"/>
+                <w:sz w:val="23"/>
               </w:rPr>
               <w:t>{{patient_name}}</w:t>
             </w:r>
@@ -84,7 +85,7 @@
             <w:r>
               <w:rPr>
                 <w:b/>
-                <w:sz w:val="21"/>
+                <w:sz w:val="23"/>
               </w:rPr>
               <w:t>Date</w:t>
             </w:r>
@@ -103,7 +104,7 @@
             <w:r>
               <w:rPr>
                 <w:b w:val="0"/>
-                <w:sz w:val="21"/>
+                <w:sz w:val="23"/>
               </w:rPr>
               <w:t>{{date}}</w:t>
             </w:r>
@@ -127,7 +128,7 @@
             <w:r>
               <w:rPr>
                 <w:b/>
-                <w:sz w:val="21"/>
+                <w:sz w:val="23"/>
               </w:rPr>
               <w:t>Age / Sex</w:t>
             </w:r>
@@ -146,7 +147,7 @@
             <w:r>
               <w:rPr>
                 <w:b w:val="0"/>
-                <w:sz w:val="21"/>
+                <w:sz w:val="23"/>
               </w:rPr>
               <w:t>{{age}} Y / F</w:t>
             </w:r>
@@ -165,7 +166,7 @@
             <w:r>
               <w:rPr>
                 <w:b/>
-                <w:sz w:val="21"/>
+                <w:sz w:val="23"/>
               </w:rPr>
               <w:t>Patient ID</w:t>
             </w:r>
@@ -184,7 +185,7 @@
             <w:r>
               <w:rPr>
                 <w:b w:val="0"/>
-                <w:sz w:val="21"/>
+                <w:sz w:val="23"/>
               </w:rPr>
               <w:t>{{patient_id}}</w:t>
             </w:r>
@@ -208,7 +209,7 @@
             <w:r>
               <w:rPr>
                 <w:b/>
-                <w:sz w:val="21"/>
+                <w:sz w:val="23"/>
               </w:rPr>
               <w:t>Referred by</w:t>
             </w:r>
@@ -228,7 +229,7 @@
             <w:r>
               <w:rPr>
                 <w:b w:val="0"/>
-                <w:sz w:val="21"/>
+                <w:sz w:val="23"/>
               </w:rPr>
               <w:t>{{ref_by}}</w:t>
             </w:r>
@@ -251,7 +252,7 @@
             <w:r>
               <w:rPr>
                 <w:b/>
-                <w:sz w:val="21"/>
+                <w:sz w:val="23"/>
               </w:rPr>
               <w:t>Clinical details</w:t>
             </w:r>
@@ -270,7 +271,7 @@
             <w:r>
               <w:rPr>
                 <w:b w:val="0"/>
-                <w:sz w:val="21"/>
+                <w:sz w:val="23"/>
               </w:rPr>
               <w:t>{{clinical_data}}</w:t>
             </w:r>
@@ -291,7 +292,7 @@
       <w:r>
         <w:rPr>
           <w:b/>
-          <w:sz w:val="22"/>
+          <w:sz w:val="26"/>
         </w:rPr>
         <w:t>FINDINGS</w:t>
       </w:r>
@@ -321,7 +322,7 @@
             <w:r>
               <w:rPr>
                 <w:b/>
-                <w:sz w:val="22"/>
+                <w:sz w:val="26"/>
               </w:rPr>
               <w:t>Liver:</w:t>
             </w:r>
@@ -338,7 +339,7 @@
             <w:r>
               <w:rPr>
                 <w:b w:val="0"/>
-                <w:sz w:val="22"/>
+                <w:sz w:val="26"/>
               </w:rPr>
               <w:t>Normal in size ({{liver_size}} cm), with normal parenchymal echogenicity, however not obscuring peri-portal or diaphragmatic echogenicity. Biliary radicles are not dilated. No obvious focal lesions seen. Portal vein is normal.</w:t>
             </w:r>
@@ -360,7 +361,7 @@
             <w:r>
               <w:rPr>
                 <w:b/>
-                <w:sz w:val="22"/>
+                <w:sz w:val="26"/>
               </w:rPr>
               <w:t>Gall bladder:</w:t>
             </w:r>
@@ -377,7 +378,7 @@
             <w:r>
               <w:rPr>
                 <w:b w:val="0"/>
-                <w:sz w:val="22"/>
+                <w:sz w:val="26"/>
               </w:rPr>
               <w:t>Distended, wall appears normal. CBD is normal.</w:t>
             </w:r>
@@ -399,7 +400,7 @@
             <w:r>
               <w:rPr>
                 <w:b/>
-                <w:sz w:val="22"/>
+                <w:sz w:val="26"/>
               </w:rPr>
               <w:t>Pancreas:</w:t>
             </w:r>
@@ -416,7 +417,7 @@
             <w:r>
               <w:rPr>
                 <w:b w:val="0"/>
-                <w:sz w:val="22"/>
+                <w:sz w:val="26"/>
               </w:rPr>
               <w:t>Head appears normal, body and tail obscured.</w:t>
             </w:r>
@@ -438,7 +439,7 @@
             <w:r>
               <w:rPr>
                 <w:b/>
-                <w:sz w:val="22"/>
+                <w:sz w:val="26"/>
               </w:rPr>
               <w:t>Spleen:</w:t>
             </w:r>
@@ -455,7 +456,7 @@
             <w:r>
               <w:rPr>
                 <w:b w:val="0"/>
-                <w:sz w:val="22"/>
+                <w:sz w:val="26"/>
               </w:rPr>
               <w:t>Appears normal ({{spleen_size}} cm) in size and echotexture. No focal lesion seen.</w:t>
             </w:r>
@@ -477,7 +478,7 @@
             <w:r>
               <w:rPr>
                 <w:b/>
-                <w:sz w:val="22"/>
+                <w:sz w:val="26"/>
               </w:rPr>
               <w:t>Right kidney:</w:t>
             </w:r>
@@ -494,7 +495,7 @@
             <w:r>
               <w:rPr>
                 <w:b w:val="0"/>
-                <w:sz w:val="22"/>
+                <w:sz w:val="26"/>
               </w:rPr>
               <w:t>Normal in size, measuring {{right_kidney_size}} cm, shape, position and echogenicity. No calculus seen. Pelvicalyceal system is not dilated.</w:t>
             </w:r>
@@ -516,7 +517,7 @@
             <w:r>
               <w:rPr>
                 <w:b/>
-                <w:sz w:val="22"/>
+                <w:sz w:val="26"/>
               </w:rPr>
               <w:t>Left kidney:</w:t>
             </w:r>
@@ -533,7 +534,7 @@
             <w:r>
               <w:rPr>
                 <w:b w:val="0"/>
-                <w:sz w:val="22"/>
+                <w:sz w:val="26"/>
               </w:rPr>
               <w:t>Normal in size, measuring {{left_kidney_size}} cm, shape, position and echogenicity. No calculus seen. Pelvicalyceal system is not dilated.</w:t>
             </w:r>
@@ -555,7 +556,7 @@
             <w:r>
               <w:rPr>
                 <w:b/>
-                <w:sz w:val="22"/>
+                <w:sz w:val="26"/>
               </w:rPr>
               <w:t>Urinary bladder:</w:t>
             </w:r>
@@ -572,7 +573,7 @@
             <w:r>
               <w:rPr>
                 <w:b w:val="0"/>
-                <w:sz w:val="22"/>
+                <w:sz w:val="26"/>
               </w:rPr>
               <w:t>Distended.</w:t>
             </w:r>
@@ -594,7 +595,7 @@
             <w:r>
               <w:rPr>
                 <w:b/>
-                <w:sz w:val="22"/>
+                <w:sz w:val="26"/>
               </w:rPr>
               <w:t>Uterus:</w:t>
             </w:r>
@@ -611,7 +612,7 @@
             <w:r>
               <w:rPr>
                 <w:b w:val="0"/>
-                <w:sz w:val="22"/>
+                <w:sz w:val="26"/>
               </w:rPr>
               <w:t>Anteverted, measuring {{uterus_size}} cm, endometrium thickness {{endometrium_mm}} mm.</w:t>
             </w:r>
@@ -633,7 +634,7 @@
             <w:r>
               <w:rPr>
                 <w:b/>
-                <w:sz w:val="22"/>
+                <w:sz w:val="26"/>
               </w:rPr>
               <w:t>Right ovary:</w:t>
             </w:r>
@@ -650,7 +651,7 @@
             <w:r>
               <w:rPr>
                 <w:b w:val="0"/>
-                <w:sz w:val="22"/>
+                <w:sz w:val="26"/>
               </w:rPr>
               <w:t>Measuring {{right_ovary_size}} cm, volume ~{{right_ovary_volume}} ml.</w:t>
             </w:r>
@@ -672,7 +673,7 @@
             <w:r>
               <w:rPr>
                 <w:b/>
-                <w:sz w:val="22"/>
+                <w:sz w:val="26"/>
               </w:rPr>
               <w:t>Left ovary:</w:t>
             </w:r>
@@ -689,7 +690,7 @@
             <w:r>
               <w:rPr>
                 <w:b w:val="0"/>
-                <w:sz w:val="22"/>
+                <w:sz w:val="26"/>
               </w:rPr>
               <w:t>Measuring {{left_ovary_size}} cm, volume ~{{left_ovary_volume}} ml.</w:t>
             </w:r>
@@ -711,7 +712,7 @@
             <w:r>
               <w:rPr>
                 <w:b/>
-                <w:sz w:val="22"/>
+                <w:sz w:val="26"/>
               </w:rPr>
               <w:t>Free fluid:</w:t>
             </w:r>
@@ -728,7 +729,7 @@
             <w:r>
               <w:rPr>
                 <w:b w:val="0"/>
-                <w:sz w:val="22"/>
+                <w:sz w:val="26"/>
               </w:rPr>
               <w:t>No free fluid noted at the time of scan.</w:t>
             </w:r>
@@ -750,7 +751,7 @@
             <w:r>
               <w:rPr>
                 <w:b/>
-                <w:sz w:val="22"/>
+                <w:sz w:val="26"/>
               </w:rPr>
               <w:t>Bowel loops:</w:t>
             </w:r>
@@ -767,7 +768,7 @@
             <w:r>
               <w:rPr>
                 <w:b w:val="0"/>
-                <w:sz w:val="22"/>
+                <w:sz w:val="26"/>
               </w:rPr>
               <w:t>Visualized bowel loops show peristalsis.</w:t>
             </w:r>
@@ -783,7 +784,7 @@
       <w:r>
         <w:rPr>
           <w:b/>
-          <w:sz w:val="22"/>
+          <w:sz w:val="26"/>
         </w:rPr>
         <w:t>IMPRESSION</w:t>
       </w:r>
@@ -805,7 +806,7 @@
       <w:r>
         <w:rPr>
           <w:b/>
-          <w:sz w:val="18"/>
+          <w:sz w:val="20"/>
         </w:rPr>
         <w:t xml:space="preserve">Note: </w:t>
       </w:r>
@@ -814,7 +815,7 @@
       </w:r>
       <w:r>
         <w:rPr>
-          <w:sz w:val="18"/>
+          <w:sz w:val="20"/>
         </w:rPr>
         <w:t>This is only a radiological impression and not a diagnosis and has its limitations. Therefore, it should be interpreted in correlation with clinical and/or pathological findings.</w:t>
       </w:r>
@@ -860,28 +861,28 @@
     </w:pPr>
     <w:r>
       <w:rPr>
-        <w:sz w:val="16"/>
+        <w:sz w:val="18"/>
       </w:rPr>
       <w:t xml:space="preserve">{{patient_name}}   |   Page </w:t>
     </w:r>
     <w:fldSimple w:instr="PAGE">
       <w:r>
         <w:rPr>
-          <w:sz w:val="16"/>
+          <w:sz w:val="18"/>
         </w:rPr>
         <w:t>1</w:t>
       </w:r>
     </w:fldSimple>
     <w:r>
       <w:rPr>
-        <w:sz w:val="16"/>
+        <w:sz w:val="18"/>
       </w:rPr>
       <w:t xml:space="preserve"> of </w:t>
     </w:r>
     <w:fldSimple w:instr="NUMPAGES">
       <w:r>
         <w:rPr>
-          <w:sz w:val="16"/>
+          <w:sz w:val="18"/>
         </w:rPr>
         <w:t>1</w:t>
       </w:r>
@@ -1258,7 +1259,7 @@
     </w:pPr>
     <w:rPr>
       <w:rFonts w:ascii="Calibri" w:hAnsi="Calibri" w:eastAsia="Calibri"/>
-      <w:sz w:val="22"/>
+      <w:sz w:val="26"/>
     </w:rPr>
   </w:style>
   <w:style w:type="paragraph" w:styleId="Header">
@@ -1298,7 +1299,7 @@
       <w:spacing w:after="0" w:line="240" w:lineRule="auto"/>
     </w:pPr>
     <w:rPr>
-      <w:sz w:val="16"/>
+      <w:sz w:val="18"/>
     </w:rPr>
   </w:style>
   <w:style w:type="character" w:customStyle="1" w:styleId="FooterChar">

</xml_diff>

<commit_message>
feat: 14 pt print text and tables, 11 pt notes
- Report text, headings, impression, signature, tables and the images
  heading 14 pt; notes and PCPNDT declaration 11 pt (title 15, page-number
  line 9 unchanged).
- Table columns rebalanced so nothing wraps at 14 pt: wider patient-box
  labels ("Clinical details"), wider "Other measurements" labels ("Trans
  cerebellar diameter"), and EFW printed as "g ± g".

Co-Authored-By: Claude Opus 5.5 <noreply@anthropic.com>
</commit_message>
<xml_diff>
--- a/templates/abdomen_pelvis_female.docx
+++ b/templates/abdomen_pelvis_female.docx
@@ -25,15 +25,53 @@
         <w:tblLook w:firstColumn="1" w:firstRow="1" w:lastColumn="0" w:lastRow="0" w:noHBand="0" w:noVBand="1" w:val="04A0"/>
       </w:tblPr>
       <w:tblGrid>
+        <w:gridCol w:w="2376"/>
+        <w:gridCol w:w="3311"/>
         <w:gridCol w:w="1872"/>
-        <w:gridCol w:w="3528"/>
-        <w:gridCol w:w="1655"/>
-        <w:gridCol w:w="3148"/>
+        <w:gridCol w:w="2644"/>
       </w:tblGrid>
       <w:tr>
         <w:trPr>
           <w:cantSplit/>
         </w:trPr>
+        <w:tc>
+          <w:tcPr>
+            <w:tcW w:type="dxa" w:w="2376"/>
+            <w:vAlign w:val="center"/>
+          </w:tcPr>
+          <w:p>
+            <w:pPr>
+              <w:keepNext/>
+              <w:spacing w:before="20" w:after="20"/>
+            </w:pPr>
+            <w:r>
+              <w:rPr>
+                <w:b/>
+                <w:sz w:val="28"/>
+              </w:rPr>
+              <w:t>Patient Name</w:t>
+            </w:r>
+          </w:p>
+        </w:tc>
+        <w:tc>
+          <w:tcPr>
+            <w:tcW w:type="dxa" w:w="3312"/>
+            <w:vAlign w:val="center"/>
+          </w:tcPr>
+          <w:p>
+            <w:pPr>
+              <w:keepNext/>
+              <w:spacing w:before="20" w:after="20"/>
+            </w:pPr>
+            <w:r>
+              <w:rPr>
+                <w:b w:val="0"/>
+                <w:sz w:val="28"/>
+              </w:rPr>
+              <w:t>{{patient_name}}</w:t>
+            </w:r>
+          </w:p>
+        </w:tc>
         <w:tc>
           <w:tcPr>
             <w:tcW w:type="dxa" w:w="1872"/>
@@ -47,15 +85,15 @@
             <w:r>
               <w:rPr>
                 <w:b/>
-                <w:sz w:val="23"/>
+                <w:sz w:val="28"/>
               </w:rPr>
-              <w:t>Patient Name</w:t>
+              <w:t>Date</w:t>
             </w:r>
           </w:p>
         </w:tc>
         <w:tc>
           <w:tcPr>
-            <w:tcW w:type="dxa" w:w="3528"/>
+            <w:tcW w:type="dxa" w:w="2645"/>
             <w:vAlign w:val="center"/>
           </w:tcPr>
           <w:p>
@@ -66,15 +104,20 @@
             <w:r>
               <w:rPr>
                 <w:b w:val="0"/>
-                <w:sz w:val="23"/>
+                <w:sz w:val="28"/>
               </w:rPr>
-              <w:t>{{patient_name}}</w:t>
+              <w:t>{{date}}</w:t>
             </w:r>
           </w:p>
         </w:tc>
+      </w:tr>
+      <w:tr>
+        <w:trPr>
+          <w:cantSplit/>
+        </w:trPr>
         <w:tc>
           <w:tcPr>
-            <w:tcW w:type="dxa" w:w="1656"/>
+            <w:tcW w:type="dxa" w:w="2376"/>
             <w:vAlign w:val="center"/>
           </w:tcPr>
           <w:p>
@@ -85,15 +128,15 @@
             <w:r>
               <w:rPr>
                 <w:b/>
-                <w:sz w:val="23"/>
+                <w:sz w:val="28"/>
               </w:rPr>
-              <w:t>Date</w:t>
+              <w:t>Age / Sex</w:t>
             </w:r>
           </w:p>
         </w:tc>
         <w:tc>
           <w:tcPr>
-            <w:tcW w:type="dxa" w:w="3149"/>
+            <w:tcW w:type="dxa" w:w="3312"/>
             <w:vAlign w:val="center"/>
           </w:tcPr>
           <w:p>
@@ -104,17 +147,12 @@
             <w:r>
               <w:rPr>
                 <w:b w:val="0"/>
-                <w:sz w:val="23"/>
+                <w:sz w:val="28"/>
               </w:rPr>
-              <w:t>{{date}}</w:t>
+              <w:t>{{age}} Y / F</w:t>
             </w:r>
           </w:p>
         </w:tc>
-      </w:tr>
-      <w:tr>
-        <w:trPr>
-          <w:cantSplit/>
-        </w:trPr>
         <w:tc>
           <w:tcPr>
             <w:tcW w:type="dxa" w:w="1872"/>
@@ -128,15 +166,15 @@
             <w:r>
               <w:rPr>
                 <w:b/>
-                <w:sz w:val="23"/>
+                <w:sz w:val="28"/>
               </w:rPr>
-              <w:t>Age / Sex</w:t>
+              <w:t>Patient ID</w:t>
             </w:r>
           </w:p>
         </w:tc>
         <w:tc>
           <w:tcPr>
-            <w:tcW w:type="dxa" w:w="3528"/>
+            <w:tcW w:type="dxa" w:w="2645"/>
             <w:vAlign w:val="center"/>
           </w:tcPr>
           <w:p>
@@ -147,45 +185,7 @@
             <w:r>
               <w:rPr>
                 <w:b w:val="0"/>
-                <w:sz w:val="23"/>
-              </w:rPr>
-              <w:t>{{age}} Y / F</w:t>
-            </w:r>
-          </w:p>
-        </w:tc>
-        <w:tc>
-          <w:tcPr>
-            <w:tcW w:type="dxa" w:w="1656"/>
-            <w:vAlign w:val="center"/>
-          </w:tcPr>
-          <w:p>
-            <w:pPr>
-              <w:keepNext/>
-              <w:spacing w:before="20" w:after="20"/>
-            </w:pPr>
-            <w:r>
-              <w:rPr>
-                <w:b/>
-                <w:sz w:val="23"/>
-              </w:rPr>
-              <w:t>Patient ID</w:t>
-            </w:r>
-          </w:p>
-        </w:tc>
-        <w:tc>
-          <w:tcPr>
-            <w:tcW w:type="dxa" w:w="3149"/>
-            <w:vAlign w:val="center"/>
-          </w:tcPr>
-          <w:p>
-            <w:pPr>
-              <w:keepNext/>
-              <w:spacing w:before="20" w:after="20"/>
-            </w:pPr>
-            <w:r>
-              <w:rPr>
-                <w:b w:val="0"/>
-                <w:sz w:val="23"/>
+                <w:sz w:val="28"/>
               </w:rPr>
               <w:t>{{patient_id}}</w:t>
             </w:r>
@@ -198,7 +198,7 @@
         </w:trPr>
         <w:tc>
           <w:tcPr>
-            <w:tcW w:type="dxa" w:w="1872"/>
+            <w:tcW w:type="dxa" w:w="2376"/>
             <w:vAlign w:val="center"/>
           </w:tcPr>
           <w:p>
@@ -209,7 +209,7 @@
             <w:r>
               <w:rPr>
                 <w:b/>
-                <w:sz w:val="23"/>
+                <w:sz w:val="28"/>
               </w:rPr>
               <w:t>Referred by</w:t>
             </w:r>
@@ -217,7 +217,7 @@
         </w:tc>
         <w:tc>
           <w:tcPr>
-            <w:tcW w:type="dxa" w:w="8333"/>
+            <w:tcW w:type="dxa" w:w="7829"/>
             <w:gridSpan w:val="3"/>
             <w:vAlign w:val="center"/>
           </w:tcPr>
@@ -229,7 +229,7 @@
             <w:r>
               <w:rPr>
                 <w:b w:val="0"/>
-                <w:sz w:val="23"/>
+                <w:sz w:val="28"/>
               </w:rPr>
               <w:t>{{ref_by}}</w:t>
             </w:r>
@@ -242,7 +242,7 @@
         </w:trPr>
         <w:tc>
           <w:tcPr>
-            <w:tcW w:type="dxa" w:w="1872"/>
+            <w:tcW w:type="dxa" w:w="2376"/>
             <w:vAlign w:val="center"/>
           </w:tcPr>
           <w:p>
@@ -252,7 +252,7 @@
             <w:r>
               <w:rPr>
                 <w:b/>
-                <w:sz w:val="23"/>
+                <w:sz w:val="28"/>
               </w:rPr>
               <w:t>Clinical details</w:t>
             </w:r>
@@ -260,7 +260,7 @@
         </w:tc>
         <w:tc>
           <w:tcPr>
-            <w:tcW w:type="dxa" w:w="8333"/>
+            <w:tcW w:type="dxa" w:w="7829"/>
             <w:gridSpan w:val="3"/>
             <w:vAlign w:val="center"/>
           </w:tcPr>
@@ -271,7 +271,7 @@
             <w:r>
               <w:rPr>
                 <w:b w:val="0"/>
-                <w:sz w:val="23"/>
+                <w:sz w:val="28"/>
               </w:rPr>
               <w:t>{{clinical_data}}</w:t>
             </w:r>
@@ -292,7 +292,7 @@
       <w:r>
         <w:rPr>
           <w:b/>
-          <w:sz w:val="26"/>
+          <w:sz w:val="28"/>
         </w:rPr>
         <w:t>FINDINGS</w:t>
       </w:r>
@@ -322,7 +322,7 @@
             <w:r>
               <w:rPr>
                 <w:b/>
-                <w:sz w:val="26"/>
+                <w:sz w:val="28"/>
               </w:rPr>
               <w:t>Liver:</w:t>
             </w:r>
@@ -339,7 +339,7 @@
             <w:r>
               <w:rPr>
                 <w:b w:val="0"/>
-                <w:sz w:val="26"/>
+                <w:sz w:val="28"/>
               </w:rPr>
               <w:t>Normal in size ({{liver_size}} cm), with normal parenchymal echogenicity, however not obscuring peri-portal or diaphragmatic echogenicity. Biliary radicles are not dilated. No obvious focal lesions seen. Portal vein is normal.</w:t>
             </w:r>
@@ -361,7 +361,7 @@
             <w:r>
               <w:rPr>
                 <w:b/>
-                <w:sz w:val="26"/>
+                <w:sz w:val="28"/>
               </w:rPr>
               <w:t>Gall bladder:</w:t>
             </w:r>
@@ -378,7 +378,7 @@
             <w:r>
               <w:rPr>
                 <w:b w:val="0"/>
-                <w:sz w:val="26"/>
+                <w:sz w:val="28"/>
               </w:rPr>
               <w:t>Distended, wall appears normal. CBD is normal.</w:t>
             </w:r>
@@ -400,7 +400,7 @@
             <w:r>
               <w:rPr>
                 <w:b/>
-                <w:sz w:val="26"/>
+                <w:sz w:val="28"/>
               </w:rPr>
               <w:t>Pancreas:</w:t>
             </w:r>
@@ -417,7 +417,7 @@
             <w:r>
               <w:rPr>
                 <w:b w:val="0"/>
-                <w:sz w:val="26"/>
+                <w:sz w:val="28"/>
               </w:rPr>
               <w:t>Head appears normal, body and tail obscured.</w:t>
             </w:r>
@@ -439,7 +439,7 @@
             <w:r>
               <w:rPr>
                 <w:b/>
-                <w:sz w:val="26"/>
+                <w:sz w:val="28"/>
               </w:rPr>
               <w:t>Spleen:</w:t>
             </w:r>
@@ -456,7 +456,7 @@
             <w:r>
               <w:rPr>
                 <w:b w:val="0"/>
-                <w:sz w:val="26"/>
+                <w:sz w:val="28"/>
               </w:rPr>
               <w:t>Appears normal ({{spleen_size}} cm) in size and echotexture. No focal lesion seen.</w:t>
             </w:r>
@@ -478,7 +478,7 @@
             <w:r>
               <w:rPr>
                 <w:b/>
-                <w:sz w:val="26"/>
+                <w:sz w:val="28"/>
               </w:rPr>
               <w:t>Right kidney:</w:t>
             </w:r>
@@ -495,7 +495,7 @@
             <w:r>
               <w:rPr>
                 <w:b w:val="0"/>
-                <w:sz w:val="26"/>
+                <w:sz w:val="28"/>
               </w:rPr>
               <w:t>Normal in size, measuring {{right_kidney_size}} cm, shape, position and echogenicity. No calculus seen. Pelvicalyceal system is not dilated.</w:t>
             </w:r>
@@ -517,7 +517,7 @@
             <w:r>
               <w:rPr>
                 <w:b/>
-                <w:sz w:val="26"/>
+                <w:sz w:val="28"/>
               </w:rPr>
               <w:t>Left kidney:</w:t>
             </w:r>
@@ -534,7 +534,7 @@
             <w:r>
               <w:rPr>
                 <w:b w:val="0"/>
-                <w:sz w:val="26"/>
+                <w:sz w:val="28"/>
               </w:rPr>
               <w:t>Normal in size, measuring {{left_kidney_size}} cm, shape, position and echogenicity. No calculus seen. Pelvicalyceal system is not dilated.</w:t>
             </w:r>
@@ -556,7 +556,7 @@
             <w:r>
               <w:rPr>
                 <w:b/>
-                <w:sz w:val="26"/>
+                <w:sz w:val="28"/>
               </w:rPr>
               <w:t>Urinary bladder:</w:t>
             </w:r>
@@ -573,7 +573,7 @@
             <w:r>
               <w:rPr>
                 <w:b w:val="0"/>
-                <w:sz w:val="26"/>
+                <w:sz w:val="28"/>
               </w:rPr>
               <w:t>Distended.</w:t>
             </w:r>
@@ -595,7 +595,7 @@
             <w:r>
               <w:rPr>
                 <w:b/>
-                <w:sz w:val="26"/>
+                <w:sz w:val="28"/>
               </w:rPr>
               <w:t>Uterus:</w:t>
             </w:r>
@@ -612,7 +612,7 @@
             <w:r>
               <w:rPr>
                 <w:b w:val="0"/>
-                <w:sz w:val="26"/>
+                <w:sz w:val="28"/>
               </w:rPr>
               <w:t>Anteverted, measuring {{uterus_size}} cm, endometrium thickness {{endometrium_mm}} mm.</w:t>
             </w:r>
@@ -634,7 +634,7 @@
             <w:r>
               <w:rPr>
                 <w:b/>
-                <w:sz w:val="26"/>
+                <w:sz w:val="28"/>
               </w:rPr>
               <w:t>Right ovary:</w:t>
             </w:r>
@@ -651,7 +651,7 @@
             <w:r>
               <w:rPr>
                 <w:b w:val="0"/>
-                <w:sz w:val="26"/>
+                <w:sz w:val="28"/>
               </w:rPr>
               <w:t>Measuring {{right_ovary_size}} cm, volume ~{{right_ovary_volume}} ml.</w:t>
             </w:r>
@@ -673,7 +673,7 @@
             <w:r>
               <w:rPr>
                 <w:b/>
-                <w:sz w:val="26"/>
+                <w:sz w:val="28"/>
               </w:rPr>
               <w:t>Left ovary:</w:t>
             </w:r>
@@ -690,7 +690,7 @@
             <w:r>
               <w:rPr>
                 <w:b w:val="0"/>
-                <w:sz w:val="26"/>
+                <w:sz w:val="28"/>
               </w:rPr>
               <w:t>Measuring {{left_ovary_size}} cm, volume ~{{left_ovary_volume}} ml.</w:t>
             </w:r>
@@ -712,7 +712,7 @@
             <w:r>
               <w:rPr>
                 <w:b/>
-                <w:sz w:val="26"/>
+                <w:sz w:val="28"/>
               </w:rPr>
               <w:t>Free fluid:</w:t>
             </w:r>
@@ -729,7 +729,7 @@
             <w:r>
               <w:rPr>
                 <w:b w:val="0"/>
-                <w:sz w:val="26"/>
+                <w:sz w:val="28"/>
               </w:rPr>
               <w:t>No free fluid noted at the time of scan.</w:t>
             </w:r>
@@ -751,7 +751,7 @@
             <w:r>
               <w:rPr>
                 <w:b/>
-                <w:sz w:val="26"/>
+                <w:sz w:val="28"/>
               </w:rPr>
               <w:t>Bowel loops:</w:t>
             </w:r>
@@ -768,7 +768,7 @@
             <w:r>
               <w:rPr>
                 <w:b w:val="0"/>
-                <w:sz w:val="26"/>
+                <w:sz w:val="28"/>
               </w:rPr>
               <w:t>Visualized bowel loops show peristalsis.</w:t>
             </w:r>
@@ -784,7 +784,7 @@
       <w:r>
         <w:rPr>
           <w:b/>
-          <w:sz w:val="26"/>
+          <w:sz w:val="28"/>
         </w:rPr>
         <w:t>IMPRESSION</w:t>
       </w:r>
@@ -806,7 +806,7 @@
       <w:r>
         <w:rPr>
           <w:b/>
-          <w:sz w:val="20"/>
+          <w:sz w:val="22"/>
         </w:rPr>
         <w:t xml:space="preserve">Note: </w:t>
       </w:r>
@@ -815,7 +815,7 @@
       </w:r>
       <w:r>
         <w:rPr>
-          <w:sz w:val="20"/>
+          <w:sz w:val="22"/>
         </w:rPr>
         <w:t>This is only a radiological impression and not a diagnosis and has its limitations. Therefore, it should be interpreted in correlation with clinical and/or pathological findings.</w:t>
       </w:r>
@@ -1259,7 +1259,7 @@
     </w:pPr>
     <w:rPr>
       <w:rFonts w:ascii="Calibri" w:hAnsi="Calibri" w:eastAsia="Calibri"/>
-      <w:sz w:val="26"/>
+      <w:sz w:val="28"/>
     </w:rPr>
   </w:style>
   <w:style w:type="paragraph" w:styleId="Header">

</xml_diff>